<commit_message>
implemented compilation for St Francis and MIC
</commit_message>
<xml_diff>
--- a/Images/Church Diagrams/Word Documents/Monastery Immaculate Conception Diagram.docx
+++ b/Images/Church Diagrams/Word Documents/Monastery Immaculate Conception Diagram.docx
@@ -1,6 +1,6 @@
 
 <file path=word/document.xml><?xml version="1.0" encoding="utf-8"?>
-<w:document xmlns:wpc="http://schemas.microsoft.com/office/word/2010/wordprocessingCanvas" xmlns:cx="http://schemas.microsoft.com/office/drawing/2014/chartex" xmlns:cx1="http://schemas.microsoft.com/office/drawing/2015/9/8/chartex" xmlns:cx2="http://schemas.microsoft.com/office/drawing/2015/10/21/chartex" xmlns:cx3="http://schemas.microsoft.com/office/drawing/2016/5/9/chartex" xmlns:cx4="http://schemas.microsoft.com/office/drawing/2016/5/10/chartex" xmlns:cx5="http://schemas.microsoft.com/office/drawing/2016/5/11/chartex" xmlns:cx6="http://schemas.microsoft.com/office/drawing/2016/5/12/chartex" xmlns:cx7="http://schemas.microsoft.com/office/drawing/2016/5/13/chartex" xmlns:cx8="http://schemas.microsoft.com/office/drawing/2016/5/14/chartex" xmlns:mc="http://schemas.openxmlformats.org/markup-compatibility/2006" xmlns:aink="http://schemas.microsoft.com/office/drawing/2016/ink" xmlns:am3d="http://schemas.microsoft.com/office/drawing/2017/model3d" xmlns:o="urn:schemas-microsoft-com:office:office" xmlns:oel="http://schemas.microsoft.com/office/2019/extlst" xmlns:r="http://schemas.openxmlformats.org/officeDocument/2006/relationships" xmlns:m="http://schemas.openxmlformats.org/officeDocument/2006/math" xmlns:v="urn:schemas-microsoft-com:vml" xmlns:wp14="http://schemas.microsoft.com/office/word/2010/wordprocessingDrawing" xmlns:wp="http://schemas.openxmlformats.org/drawingml/2006/wordprocessingDrawing" xmlns:w10="urn:schemas-microsoft-com:office:word" xmlns:w="http://schemas.openxmlformats.org/wordprocessingml/2006/main" xmlns:w14="http://schemas.microsoft.com/office/word/2010/wordml" xmlns:w15="http://schemas.microsoft.com/office/word/2012/wordml" xmlns:w16cei="http://schemas.microsoft.com/office/word/2026/wordml/cei" xmlns:w16cex="http://schemas.microsoft.com/office/word/2018/wordml/cex" xmlns:w16cid="http://schemas.microsoft.com/office/word/2016/wordml/cid" xmlns:w16="http://schemas.microsoft.com/office/word/2018/wordml" xmlns:w16du="http://schemas.microsoft.com/office/word/2023/wordml/word16du" xmlns:w16sdtdh="http://schemas.microsoft.com/office/word/2020/wordml/sdtdatahash" xmlns:w16sdtfl="http://schemas.microsoft.com/office/word/2024/wordml/sdtformatlock" xmlns:w16se="http://schemas.microsoft.com/office/word/2015/wordml/symex" xmlns:wpg="http://schemas.microsoft.com/office/word/2010/wordprocessingGroup" xmlns:wpi="http://schemas.microsoft.com/office/word/2010/wordprocessingInk" xmlns:wne="http://schemas.microsoft.com/office/word/2006/wordml" xmlns:wps="http://schemas.microsoft.com/office/word/2010/wordprocessingShape" mc:Ignorable="w14 w15 w16se w16cid w16 w16cex w16sdtdh w16sdtfl w16du wp14">
+<w:document xmlns:wpc="http://schemas.microsoft.com/office/word/2010/wordprocessingCanvas" xmlns:cx="http://schemas.microsoft.com/office/drawing/2014/chartex" xmlns:cx1="http://schemas.microsoft.com/office/drawing/2015/9/8/chartex" xmlns:cx2="http://schemas.microsoft.com/office/drawing/2015/10/21/chartex" xmlns:cx3="http://schemas.microsoft.com/office/drawing/2016/5/9/chartex" xmlns:cx4="http://schemas.microsoft.com/office/drawing/2016/5/10/chartex" xmlns:cx5="http://schemas.microsoft.com/office/drawing/2016/5/11/chartex" xmlns:cx6="http://schemas.microsoft.com/office/drawing/2016/5/12/chartex" xmlns:cx7="http://schemas.microsoft.com/office/drawing/2016/5/13/chartex" xmlns:cx8="http://schemas.microsoft.com/office/drawing/2016/5/14/chartex" xmlns:mc="http://schemas.openxmlformats.org/markup-compatibility/2006" xmlns:m="http://schemas.openxmlformats.org/officeDocument/2006/math" xmlns:aink="http://schemas.microsoft.com/office/drawing/2016/ink" xmlns:am3d="http://schemas.microsoft.com/office/drawing/2017/model3d" xmlns:oel="http://schemas.microsoft.com/office/2019/extlst" xmlns:r="http://schemas.openxmlformats.org/officeDocument/2006/relationships" xmlns:wp14="http://schemas.microsoft.com/office/word/2010/wordprocessingDrawing" xmlns:wp="http://schemas.openxmlformats.org/drawingml/2006/wordprocessingDrawing" xmlns:wpg="http://schemas.microsoft.com/office/word/2010/wordprocessingGroup" xmlns:wpi="http://schemas.microsoft.com/office/word/2010/wordprocessingInk" xmlns:wps="http://schemas.microsoft.com/office/word/2010/wordprocessingShape" xmlns:o="urn:schemas-microsoft-com:office:office" xmlns:v="urn:schemas-microsoft-com:vml" xmlns:w10="urn:schemas-microsoft-com:office:word" xmlns:w="http://schemas.openxmlformats.org/wordprocessingml/2006/main" xmlns:w14="http://schemas.microsoft.com/office/word/2010/wordml" xmlns:w15="http://schemas.microsoft.com/office/word/2012/wordml" xmlns:w16cei="http://schemas.microsoft.com/office/word/2026/wordml/cei" xmlns:w16cex="http://schemas.microsoft.com/office/word/2018/wordml/cex" xmlns:w16cid="http://schemas.microsoft.com/office/word/2016/wordml/cid" xmlns:w16="http://schemas.microsoft.com/office/word/2018/wordml" xmlns:w16sdtdh="http://schemas.microsoft.com/office/word/2020/wordml/sdtdatahash" xmlns:w16sdtfl="http://schemas.microsoft.com/office/word/2024/wordml/sdtformatlock" xmlns:w16se="http://schemas.microsoft.com/office/word/2015/wordml/symex" xmlns:w16du="http://schemas.microsoft.com/office/word/2023/wordml/word16du" xmlns:wne="http://schemas.microsoft.com/office/word/2006/wordml" mc:Ignorable="w14 w15 w16se w16cid w16 w16cex w16sdtdh w16sdtfl w16du wp14">
   <w:body>
     <w:p>
       <w:r>
@@ -10,7 +10,7 @@
         <mc:AlternateContent>
           <mc:Choice Requires="wps">
             <w:drawing>
-              <wp:anchor distT="0" distB="0" distL="114300" distR="114300" simplePos="0" relativeHeight="251659264" behindDoc="0" locked="0" layoutInCell="1" allowOverlap="1" wp14:anchorId="3B6882B8" wp14:editId="259E0169">
+              <wp:anchor distT="0" distB="0" distL="114300" distR="114300" simplePos="0" relativeHeight="251658240" behindDoc="0" locked="0" layoutInCell="1" allowOverlap="1" wp14:anchorId="3B6882B8" wp14:editId="0CA80AA7">
                 <wp:simplePos x="0" y="0"/>
                 <wp:positionH relativeFrom="page">
                   <wp:posOffset>244475</wp:posOffset>
@@ -153,7 +153,7 @@
                 <v:stroke joinstyle="miter"/>
                 <v:path gradientshapeok="t" o:connecttype="rect"/>
               </v:shapetype>
-              <v:shape id="Text Box 3" o:spid="_x0000_s1026" type="#_x0000_t202" style="position:absolute;margin-left:19.25pt;margin-top:28.8pt;width:212.4pt;height:64.05pt;z-index:251659264;visibility:visible;mso-wrap-style:square;mso-width-percent:0;mso-height-percent:0;mso-wrap-distance-left:9pt;mso-wrap-distance-top:0;mso-wrap-distance-right:9pt;mso-wrap-distance-bottom:0;mso-position-horizontal:absolute;mso-position-horizontal-relative:page;mso-position-vertical:absolute;mso-position-vertical-relative:page;mso-width-percent:0;mso-height-percent:0;mso-width-relative:margin;mso-height-relative:margin;v-text-anchor:top" o:gfxdata="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" fillcolor="white [3201]" strokeweight=".5pt">
+              <v:shape id="Text Box 3" o:spid="_x0000_s1026" type="#_x0000_t202" style="position:absolute;margin-left:19.25pt;margin-top:28.8pt;width:212.4pt;height:64.05pt;z-index:251658240;visibility:visible;mso-wrap-style:square;mso-width-percent:0;mso-height-percent:0;mso-wrap-distance-left:9pt;mso-wrap-distance-top:0;mso-wrap-distance-right:9pt;mso-wrap-distance-bottom:0;mso-position-horizontal:absolute;mso-position-horizontal-relative:page;mso-position-vertical:absolute;mso-position-vertical-relative:page;mso-width-percent:0;mso-height-percent:0;mso-width-relative:margin;mso-height-relative:margin;v-text-anchor:top" o:gfxdata="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" fillcolor="white [3201]" strokeweight=".5pt">
                 <v:textbox>
                   <w:txbxContent>
                     <w:p>
@@ -252,7 +252,7 @@
         <mc:AlternateContent>
           <mc:Choice Requires="wpi">
             <w:drawing>
-              <wp:anchor distT="0" distB="0" distL="114300" distR="114300" simplePos="0" relativeHeight="251692032" behindDoc="0" locked="0" layoutInCell="1" allowOverlap="1" wp14:anchorId="1C40C240" wp14:editId="3D26DBB6">
+              <wp:anchor distT="0" distB="0" distL="114300" distR="114300" simplePos="0" relativeHeight="251691008" behindDoc="0" locked="0" layoutInCell="1" allowOverlap="1" wp14:anchorId="1C40C240" wp14:editId="7D069AAD">
                 <wp:simplePos x="0" y="0"/>
                 <wp:positionH relativeFrom="column">
                   <wp:posOffset>4184618</wp:posOffset>
@@ -283,7 +283,7 @@
           </mc:Choice>
           <mc:Fallback>
             <w:pict>
-              <v:shapetype w14:anchorId="3973172A" id="_x0000_t75" coordsize="21600,21600" o:spt="75" o:preferrelative="t" path="m@4@5l@4@11@9@11@9@5xe" filled="f" stroked="f">
+              <v:shapetype w14:anchorId="29F37BED" id="_x0000_t75" coordsize="21600,21600" o:spt="75" o:preferrelative="t" path="m@4@5l@4@11@9@11@9@5xe" filled="f" stroked="f">
                 <v:stroke joinstyle="miter"/>
                 <v:formulas>
                   <v:f eqn="if lineDrawn pixelLineWidth 0"/>
@@ -302,7 +302,7 @@
                 <v:path o:extrusionok="f" gradientshapeok="t" o:connecttype="rect"/>
                 <o:lock v:ext="edit" aspectratio="t"/>
               </v:shapetype>
-              <v:shape id="Ink 28" o:spid="_x0000_s1026" type="#_x0000_t75" style="position:absolute;margin-left:328.1pt;margin-top:79.3pt;width:2.9pt;height:2.9pt;z-index:251692032;visibility:visible;mso-wrap-style:square;mso-wrap-distance-left:9pt;mso-wrap-distance-top:0;mso-wrap-distance-right:9pt;mso-wrap-distance-bottom:0;mso-position-horizontal:absolute;mso-position-horizontal-relative:text;mso-position-vertical:absolute;mso-position-vertical-relative:text" o:gfxdata="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">
+              <v:shape id="Ink 28" o:spid="_x0000_s1026" type="#_x0000_t75" style="position:absolute;margin-left:328.1pt;margin-top:79.3pt;width:2.9pt;height:2.9pt;z-index:251691008;visibility:visible;mso-wrap-style:square;mso-wrap-distance-left:9pt;mso-wrap-distance-top:0;mso-wrap-distance-right:9pt;mso-wrap-distance-bottom:0;mso-position-horizontal:absolute;mso-position-horizontal-relative:text;mso-position-vertical:absolute;mso-position-vertical-relative:text" o:gfxdata="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">
                 <v:imagedata r:id="rId5" o:title=""/>
               </v:shape>
             </w:pict>
@@ -316,7 +316,7 @@
         <mc:AlternateContent>
           <mc:Choice Requires="wpi">
             <w:drawing>
-              <wp:anchor distT="0" distB="0" distL="114300" distR="114300" simplePos="0" relativeHeight="251682816" behindDoc="0" locked="0" layoutInCell="1" allowOverlap="1" wp14:anchorId="27AEDCBB" wp14:editId="08DF258F">
+              <wp:anchor distT="0" distB="0" distL="114300" distR="114300" simplePos="0" relativeHeight="251681792" behindDoc="0" locked="0" layoutInCell="1" allowOverlap="1" wp14:anchorId="27AEDCBB" wp14:editId="44DBB811">
                 <wp:simplePos x="0" y="0"/>
                 <wp:positionH relativeFrom="column">
                   <wp:posOffset>5590313</wp:posOffset>
@@ -347,27 +347,8 @@
           </mc:Choice>
           <mc:Fallback>
             <w:pict>
-              <v:shapetype w14:anchorId="54FE6819" id="_x0000_t75" coordsize="21600,21600" o:spt="75" o:preferrelative="t" path="m@4@5l@4@11@9@11@9@5xe" filled="f" stroked="f">
-                <v:stroke joinstyle="miter"/>
-                <v:formulas>
-                  <v:f eqn="if lineDrawn pixelLineWidth 0"/>
-                  <v:f eqn="sum @0 1 0"/>
-                  <v:f eqn="sum 0 0 @1"/>
-                  <v:f eqn="prod @2 1 2"/>
-                  <v:f eqn="prod @3 21600 pixelWidth"/>
-                  <v:f eqn="prod @3 21600 pixelHeight"/>
-                  <v:f eqn="sum @0 0 1"/>
-                  <v:f eqn="prod @6 1 2"/>
-                  <v:f eqn="prod @7 21600 pixelWidth"/>
-                  <v:f eqn="sum @8 21600 0"/>
-                  <v:f eqn="prod @7 21600 pixelHeight"/>
-                  <v:f eqn="sum @10 21600 0"/>
-                </v:formulas>
-                <v:path o:extrusionok="f" gradientshapeok="t" o:connecttype="rect"/>
-                <o:lock v:ext="edit" aspectratio="t"/>
-              </v:shapetype>
-              <v:shape id="Ink 25" o:spid="_x0000_s1026" type="#_x0000_t75" style="position:absolute;margin-left:438.8pt;margin-top:192.65pt;width:2.9pt;height:2.9pt;z-index:251682816;visibility:visible;mso-wrap-style:square;mso-wrap-distance-left:9pt;mso-wrap-distance-top:0;mso-wrap-distance-right:9pt;mso-wrap-distance-bottom:0;mso-position-horizontal:absolute;mso-position-horizontal-relative:text;mso-position-vertical:absolute;mso-position-vertical-relative:text" o:gfxdata="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">
-                <v:imagedata r:id="rId7" o:title=""/>
+              <v:shape w14:anchorId="39D7CD30" id="Ink 25" o:spid="_x0000_s1026" type="#_x0000_t75" style="position:absolute;margin-left:438.8pt;margin-top:192.65pt;width:2.9pt;height:2.9pt;z-index:251681792;visibility:visible;mso-wrap-style:square;mso-wrap-distance-left:9pt;mso-wrap-distance-top:0;mso-wrap-distance-right:9pt;mso-wrap-distance-bottom:0;mso-position-horizontal:absolute;mso-position-horizontal-relative:text;mso-position-vertical:absolute;mso-position-vertical-relative:text" o:gfxdata="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">
+                <v:imagedata r:id="rId5" o:title=""/>
               </v:shape>
             </w:pict>
           </mc:Fallback>
@@ -380,7 +361,7 @@
         <mc:AlternateContent>
           <mc:Choice Requires="wpi">
             <w:drawing>
-              <wp:anchor distT="0" distB="0" distL="114300" distR="114300" simplePos="0" relativeHeight="251673600" behindDoc="0" locked="0" layoutInCell="1" allowOverlap="1" wp14:anchorId="31A73929" wp14:editId="5882F2B1">
+              <wp:anchor distT="0" distB="0" distL="114300" distR="114300" simplePos="0" relativeHeight="251672576" behindDoc="0" locked="0" layoutInCell="1" allowOverlap="1" wp14:anchorId="31A73929" wp14:editId="079D9EA4">
                 <wp:simplePos x="0" y="0"/>
                 <wp:positionH relativeFrom="column">
                   <wp:posOffset>1662978</wp:posOffset>
@@ -395,7 +376,7 @@
                 <wp:cNvGraphicFramePr/>
                 <a:graphic xmlns:a="http://schemas.openxmlformats.org/drawingml/2006/main">
                   <a:graphicData uri="http://schemas.microsoft.com/office/word/2010/wordprocessingInk">
-                    <w14:contentPart bwMode="auto" r:id="rId8">
+                    <w14:contentPart bwMode="auto" r:id="rId7">
                       <w14:nvContentPartPr>
                         <w14:cNvContentPartPr/>
                       </w14:nvContentPartPr>
@@ -411,8 +392,8 @@
           </mc:Choice>
           <mc:Fallback>
             <w:pict>
-              <v:shape w14:anchorId="26410FAD" id="Ink 11" o:spid="_x0000_s1026" type="#_x0000_t75" style="position:absolute;margin-left:130.25pt;margin-top:71.8pt;width:1.45pt;height:1.45pt;z-index:251673600;visibility:visible;mso-wrap-style:square;mso-wrap-distance-left:9pt;mso-wrap-distance-top:0;mso-wrap-distance-right:9pt;mso-wrap-distance-bottom:0;mso-position-horizontal:absolute;mso-position-horizontal-relative:text;mso-position-vertical:absolute;mso-position-vertical-relative:text" o:gfxdata="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">
-                <v:imagedata r:id="rId9" o:title=""/>
+              <v:shape w14:anchorId="29E01E4D" id="Ink 11" o:spid="_x0000_s1026" type="#_x0000_t75" style="position:absolute;margin-left:130.25pt;margin-top:71.8pt;width:1.45pt;height:1.45pt;z-index:251672576;visibility:visible;mso-wrap-style:square;mso-wrap-distance-left:9pt;mso-wrap-distance-top:0;mso-wrap-distance-right:9pt;mso-wrap-distance-bottom:0;mso-position-horizontal:absolute;mso-position-horizontal-relative:text;mso-position-vertical:absolute;mso-position-vertical-relative:text" o:gfxdata="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">
+                <v:imagedata r:id="rId8" o:title=""/>
               </v:shape>
             </w:pict>
           </mc:Fallback>
@@ -430,16 +411,16 @@
         <mc:AlternateContent>
           <mc:Choice Requires="wps">
             <w:drawing>
-              <wp:anchor distT="0" distB="0" distL="114300" distR="114300" simplePos="0" relativeHeight="251661312" behindDoc="0" locked="0" layoutInCell="1" allowOverlap="1" wp14:anchorId="116B8545" wp14:editId="3AFF4CDB">
+              <wp:anchor distT="0" distB="0" distL="114300" distR="114300" simplePos="0" relativeHeight="251660288" behindDoc="0" locked="0" layoutInCell="1" allowOverlap="1" wp14:anchorId="116B8545" wp14:editId="25AD6237">
                 <wp:simplePos x="0" y="0"/>
                 <wp:positionH relativeFrom="page">
-                  <wp:posOffset>238125</wp:posOffset>
+                  <wp:posOffset>239486</wp:posOffset>
                 </wp:positionH>
                 <wp:positionV relativeFrom="page">
-                  <wp:posOffset>1343025</wp:posOffset>
+                  <wp:posOffset>1338943</wp:posOffset>
                 </wp:positionV>
-                <wp:extent cx="2295525" cy="5244353"/>
-                <wp:effectExtent l="0" t="0" r="28575" b="13970"/>
+                <wp:extent cx="2503714" cy="5244353"/>
+                <wp:effectExtent l="0" t="0" r="11430" b="13970"/>
                 <wp:wrapNone/>
                 <wp:docPr id="1325435061" name="Text Box 3"/>
                 <wp:cNvGraphicFramePr/>
@@ -450,7 +431,7 @@
                       <wps:spPr>
                         <a:xfrm>
                           <a:off x="0" y="0"/>
-                          <a:ext cx="2295525" cy="5244353"/>
+                          <a:ext cx="2503714" cy="5244353"/>
                         </a:xfrm>
                         <a:prstGeom prst="rect">
                           <a:avLst/>
@@ -766,11 +747,7 @@
           </mc:Choice>
           <mc:Fallback>
             <w:pict>
-              <v:shapetype w14:anchorId="116B8545" id="_x0000_t202" coordsize="21600,21600" o:spt="202" path="m,l,21600r21600,l21600,xe">
-                <v:stroke joinstyle="miter"/>
-                <v:path gradientshapeok="t" o:connecttype="rect"/>
-              </v:shapetype>
-              <v:shape id="_x0000_s1027" type="#_x0000_t202" style="position:absolute;margin-left:18.75pt;margin-top:105.75pt;width:180.75pt;height:412.95pt;z-index:251661312;visibility:visible;mso-wrap-style:square;mso-width-percent:0;mso-height-percent:0;mso-wrap-distance-left:9pt;mso-wrap-distance-top:0;mso-wrap-distance-right:9pt;mso-wrap-distance-bottom:0;mso-position-horizontal:absolute;mso-position-horizontal-relative:page;mso-position-vertical:absolute;mso-position-vertical-relative:page;mso-width-percent:0;mso-height-percent:0;mso-width-relative:margin;mso-height-relative:margin;v-text-anchor:top" o:gfxdata="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" fillcolor="white [3201]" strokeweight=".5pt">
+              <v:shape w14:anchorId="116B8545" id="_x0000_s1027" type="#_x0000_t202" style="position:absolute;margin-left:18.85pt;margin-top:105.45pt;width:197.15pt;height:412.95pt;z-index:251660288;visibility:visible;mso-wrap-style:square;mso-width-percent:0;mso-height-percent:0;mso-wrap-distance-left:9pt;mso-wrap-distance-top:0;mso-wrap-distance-right:9pt;mso-wrap-distance-bottom:0;mso-position-horizontal:absolute;mso-position-horizontal-relative:page;mso-position-vertical:absolute;mso-position-vertical-relative:page;mso-width-percent:0;mso-height-percent:0;mso-width-relative:margin;mso-height-relative:margin;v-text-anchor:top" o:gfxdata="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" fillcolor="white [3201]" strokeweight=".5pt">
                 <v:textbox>
                   <w:txbxContent>
                     <w:p>
@@ -1075,50 +1052,395 @@
         <w:rPr>
           <w:noProof/>
         </w:rPr>
-        <w:drawing>
-          <wp:inline distT="0" distB="0" distL="0" distR="0" wp14:anchorId="2B1C4037" wp14:editId="75D83679">
-            <wp:extent cx="3391382" cy="6494363"/>
-            <wp:effectExtent l="0" t="0" r="5715" b="0"/>
-            <wp:docPr id="1171954466" name="Picture 27"/>
-            <wp:cNvGraphicFramePr>
-              <a:graphicFrameLocks xmlns:a="http://schemas.openxmlformats.org/drawingml/2006/main" noChangeAspect="1"/>
-            </wp:cNvGraphicFramePr>
-            <a:graphic xmlns:a="http://schemas.openxmlformats.org/drawingml/2006/main">
-              <a:graphicData uri="http://schemas.openxmlformats.org/drawingml/2006/picture">
-                <pic:pic xmlns:pic="http://schemas.openxmlformats.org/drawingml/2006/picture">
-                  <pic:nvPicPr>
-                    <pic:cNvPr id="1171954466" name="Picture 1171954466"/>
-                    <pic:cNvPicPr/>
-                  </pic:nvPicPr>
-                  <pic:blipFill rotWithShape="1">
-                    <a:blip r:embed="rId10"/>
-                    <a:srcRect l="30788" t="9817" r="29987" b="33053"/>
-                    <a:stretch>
-                      <a:fillRect/>
-                    </a:stretch>
-                  </pic:blipFill>
-                  <pic:spPr bwMode="auto">
-                    <a:xfrm>
-                      <a:off x="0" y="0"/>
-                      <a:ext cx="3391382" cy="6494363"/>
-                    </a:xfrm>
-                    <a:prstGeom prst="rect">
-                      <a:avLst/>
-                    </a:prstGeom>
-                    <a:ln>
-                      <a:noFill/>
-                    </a:ln>
-                    <a:extLst>
-                      <a:ext uri="{53640926-AAD7-44D8-BBD7-CCE9431645EC}">
-                        <a14:shadowObscured xmlns:a14="http://schemas.microsoft.com/office/drawing/2010/main"/>
-                      </a:ext>
-                    </a:extLst>
-                  </pic:spPr>
-                </pic:pic>
-              </a:graphicData>
-            </a:graphic>
-          </wp:inline>
-        </w:drawing>
+        <mc:AlternateContent>
+          <mc:Choice Requires="wps">
+            <w:drawing>
+              <wp:anchor distT="0" distB="0" distL="114300" distR="114300" simplePos="0" relativeHeight="251778048" behindDoc="0" locked="0" layoutInCell="1" allowOverlap="1" wp14:anchorId="01BC8C90" wp14:editId="3F8EABD1">
+                <wp:simplePos x="0" y="0"/>
+                <wp:positionH relativeFrom="column">
+                  <wp:posOffset>5491166</wp:posOffset>
+                </wp:positionH>
+                <wp:positionV relativeFrom="paragraph">
+                  <wp:posOffset>3282829</wp:posOffset>
+                </wp:positionV>
+                <wp:extent cx="622300" cy="239395"/>
+                <wp:effectExtent l="0" t="0" r="0" b="0"/>
+                <wp:wrapNone/>
+                <wp:docPr id="666817318" name="Text Box 12"/>
+                <wp:cNvGraphicFramePr/>
+                <a:graphic xmlns:a="http://schemas.openxmlformats.org/drawingml/2006/main">
+                  <a:graphicData uri="http://schemas.microsoft.com/office/word/2010/wordprocessingShape">
+                    <wps:wsp>
+                      <wps:cNvSpPr txBox="1"/>
+                      <wps:spPr>
+                        <a:xfrm>
+                          <a:off x="0" y="0"/>
+                          <a:ext cx="622300" cy="239395"/>
+                        </a:xfrm>
+                        <a:prstGeom prst="rect">
+                          <a:avLst/>
+                        </a:prstGeom>
+                        <a:noFill/>
+                        <a:ln w="6350">
+                          <a:noFill/>
+                        </a:ln>
+                      </wps:spPr>
+                      <wps:txbx>
+                        <w:txbxContent>
+                          <w:p>
+                            <w:pPr>
+                              <w:jc w:val="center"/>
+                              <w:rPr>
+                                <w:rFonts w:ascii="Times New Roman" w:hAnsi="Times New Roman" w:cs="Times New Roman"/>
+                                <w:sz w:val="20"/>
+                                <w:szCs w:val="20"/>
+                              </w:rPr>
+                            </w:pPr>
+                            <w:r>
+                              <w:rPr>
+                                <w:rFonts w:ascii="Times New Roman" w:hAnsi="Times New Roman" w:cs="Times New Roman"/>
+                                <w:sz w:val="20"/>
+                                <w:szCs w:val="20"/>
+                              </w:rPr>
+                              <w:t>151.43’</w:t>
+                            </w:r>
+                          </w:p>
+                        </w:txbxContent>
+                      </wps:txbx>
+                      <wps:bodyPr rot="0" spcFirstLastPara="0" vertOverflow="overflow" horzOverflow="overflow" vert="horz" wrap="square" lIns="91440" tIns="45720" rIns="91440" bIns="45720" numCol="1" spcCol="0" rtlCol="0" fromWordArt="0" anchor="t" anchorCtr="0" forceAA="0" compatLnSpc="1">
+                        <a:prstTxWarp prst="textNoShape">
+                          <a:avLst/>
+                        </a:prstTxWarp>
+                        <a:noAutofit/>
+                      </wps:bodyPr>
+                    </wps:wsp>
+                  </a:graphicData>
+                </a:graphic>
+                <wp14:sizeRelH relativeFrom="margin">
+                  <wp14:pctWidth>0</wp14:pctWidth>
+                </wp14:sizeRelH>
+                <wp14:sizeRelV relativeFrom="margin">
+                  <wp14:pctHeight>0</wp14:pctHeight>
+                </wp14:sizeRelV>
+              </wp:anchor>
+            </w:drawing>
+          </mc:Choice>
+          <mc:Fallback>
+            <w:pict>
+              <v:shape w14:anchorId="01BC8C90" id="Text Box 12" o:spid="_x0000_s1028" type="#_x0000_t202" style="position:absolute;left:0;text-align:left;margin-left:432.4pt;margin-top:258.5pt;width:49pt;height:18.85pt;z-index:251778048;visibility:visible;mso-wrap-style:square;mso-width-percent:0;mso-height-percent:0;mso-wrap-distance-left:9pt;mso-wrap-distance-top:0;mso-wrap-distance-right:9pt;mso-wrap-distance-bottom:0;mso-position-horizontal:absolute;mso-position-horizontal-relative:text;mso-position-vertical:absolute;mso-position-vertical-relative:text;mso-width-percent:0;mso-height-percent:0;mso-width-relative:margin;mso-height-relative:margin;v-text-anchor:top" o:gfxdata="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" filled="f" stroked="f" strokeweight=".5pt">
+                <v:textbox>
+                  <w:txbxContent>
+                    <w:p>
+                      <w:pPr>
+                        <w:jc w:val="center"/>
+                        <w:rPr>
+                          <w:rFonts w:ascii="Times New Roman" w:hAnsi="Times New Roman" w:cs="Times New Roman"/>
+                          <w:sz w:val="20"/>
+                          <w:szCs w:val="20"/>
+                        </w:rPr>
+                      </w:pPr>
+                      <w:r>
+                        <w:rPr>
+                          <w:rFonts w:ascii="Times New Roman" w:hAnsi="Times New Roman" w:cs="Times New Roman"/>
+                          <w:sz w:val="20"/>
+                          <w:szCs w:val="20"/>
+                        </w:rPr>
+                        <w:t>151.43’</w:t>
+                      </w:r>
+                    </w:p>
+                  </w:txbxContent>
+                </v:textbox>
+              </v:shape>
+            </w:pict>
+          </mc:Fallback>
+        </mc:AlternateContent>
+      </w:r>
+      <w:r>
+        <w:rPr>
+          <w:noProof/>
+        </w:rPr>
+        <mc:AlternateContent>
+          <mc:Choice Requires="wpg">
+            <w:drawing>
+              <wp:anchor distT="0" distB="0" distL="114300" distR="114300" simplePos="0" relativeHeight="251773952" behindDoc="0" locked="0" layoutInCell="1" allowOverlap="1" wp14:anchorId="180D0967" wp14:editId="09AA3E57">
+                <wp:simplePos x="0" y="0"/>
+                <wp:positionH relativeFrom="column">
+                  <wp:posOffset>2606197</wp:posOffset>
+                </wp:positionH>
+                <wp:positionV relativeFrom="paragraph">
+                  <wp:posOffset>3408204</wp:posOffset>
+                </wp:positionV>
+                <wp:extent cx="5795963" cy="354965"/>
+                <wp:effectExtent l="2540" t="0" r="10795" b="23495"/>
+                <wp:wrapNone/>
+                <wp:docPr id="631357244" name="Group 21"/>
+                <wp:cNvGraphicFramePr/>
+                <a:graphic xmlns:a="http://schemas.openxmlformats.org/drawingml/2006/main">
+                  <a:graphicData uri="http://schemas.microsoft.com/office/word/2010/wordprocessingGroup">
+                    <wpg:wgp>
+                      <wpg:cNvGrpSpPr/>
+                      <wpg:grpSpPr>
+                        <a:xfrm rot="5400000">
+                          <a:off x="0" y="0"/>
+                          <a:ext cx="5795963" cy="354965"/>
+                          <a:chOff x="0" y="0"/>
+                          <a:chExt cx="2531533" cy="209825"/>
+                        </a:xfrm>
+                      </wpg:grpSpPr>
+                      <wps:wsp>
+                        <wps:cNvPr id="437463088" name="Straight Connector 18"/>
+                        <wps:cNvCnPr/>
+                        <wps:spPr>
+                          <a:xfrm>
+                            <a:off x="0" y="112466"/>
+                            <a:ext cx="2531533" cy="0"/>
+                          </a:xfrm>
+                          <a:prstGeom prst="line">
+                            <a:avLst/>
+                          </a:prstGeom>
+                        </wps:spPr>
+                        <wps:style>
+                          <a:lnRef idx="1">
+                            <a:schemeClr val="dk1"/>
+                          </a:lnRef>
+                          <a:fillRef idx="0">
+                            <a:schemeClr val="dk1"/>
+                          </a:fillRef>
+                          <a:effectRef idx="0">
+                            <a:schemeClr val="dk1"/>
+                          </a:effectRef>
+                          <a:fontRef idx="minor">
+                            <a:schemeClr val="tx1"/>
+                          </a:fontRef>
+                        </wps:style>
+                        <wps:bodyPr/>
+                      </wps:wsp>
+                      <wps:wsp>
+                        <wps:cNvPr id="264979235" name="Straight Connector 19"/>
+                        <wps:cNvCnPr/>
+                        <wps:spPr>
+                          <a:xfrm>
+                            <a:off x="0" y="0"/>
+                            <a:ext cx="0" cy="209825"/>
+                          </a:xfrm>
+                          <a:prstGeom prst="line">
+                            <a:avLst/>
+                          </a:prstGeom>
+                        </wps:spPr>
+                        <wps:style>
+                          <a:lnRef idx="1">
+                            <a:schemeClr val="dk1"/>
+                          </a:lnRef>
+                          <a:fillRef idx="0">
+                            <a:schemeClr val="dk1"/>
+                          </a:fillRef>
+                          <a:effectRef idx="0">
+                            <a:schemeClr val="dk1"/>
+                          </a:effectRef>
+                          <a:fontRef idx="minor">
+                            <a:schemeClr val="tx1"/>
+                          </a:fontRef>
+                        </wps:style>
+                        <wps:bodyPr/>
+                      </wps:wsp>
+                      <wps:wsp>
+                        <wps:cNvPr id="119726557" name="Straight Connector 19"/>
+                        <wps:cNvCnPr/>
+                        <wps:spPr>
+                          <a:xfrm>
+                            <a:off x="2528047" y="0"/>
+                            <a:ext cx="0" cy="209825"/>
+                          </a:xfrm>
+                          <a:prstGeom prst="line">
+                            <a:avLst/>
+                          </a:prstGeom>
+                        </wps:spPr>
+                        <wps:style>
+                          <a:lnRef idx="1">
+                            <a:schemeClr val="dk1"/>
+                          </a:lnRef>
+                          <a:fillRef idx="0">
+                            <a:schemeClr val="dk1"/>
+                          </a:fillRef>
+                          <a:effectRef idx="0">
+                            <a:schemeClr val="dk1"/>
+                          </a:effectRef>
+                          <a:fontRef idx="minor">
+                            <a:schemeClr val="tx1"/>
+                          </a:fontRef>
+                        </wps:style>
+                        <wps:bodyPr/>
+                      </wps:wsp>
+                    </wpg:wgp>
+                  </a:graphicData>
+                </a:graphic>
+                <wp14:sizeRelH relativeFrom="margin">
+                  <wp14:pctWidth>0</wp14:pctWidth>
+                </wp14:sizeRelH>
+                <wp14:sizeRelV relativeFrom="margin">
+                  <wp14:pctHeight>0</wp14:pctHeight>
+                </wp14:sizeRelV>
+              </wp:anchor>
+            </w:drawing>
+          </mc:Choice>
+          <mc:Fallback>
+            <w:pict>
+              <v:group w14:anchorId="48E2970B" id="Group 21" o:spid="_x0000_s1026" style="position:absolute;margin-left:205.2pt;margin-top:268.35pt;width:456.4pt;height:27.95pt;rotation:90;z-index:251773952;mso-width-relative:margin;mso-height-relative:margin" coordsize="25315,2098" o:gfxdata="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">
+                <v:line id="Straight Connector 18" o:spid="_x0000_s1027" style="position:absolute;visibility:visible;mso-wrap-style:square" from="0,1124" to="25315,1124" o:connectortype="straight" o:gfxdata="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" strokecolor="black [3200]" strokeweight=".5pt">
+                  <v:stroke joinstyle="miter"/>
+                </v:line>
+                <v:line id="Straight Connector 19" o:spid="_x0000_s1028" style="position:absolute;visibility:visible;mso-wrap-style:square" from="0,0" to="0,2098" o:connectortype="straight" o:gfxdata="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" strokecolor="black [3200]" strokeweight=".5pt">
+                  <v:stroke joinstyle="miter"/>
+                </v:line>
+                <v:line id="Straight Connector 19" o:spid="_x0000_s1029" style="position:absolute;visibility:visible;mso-wrap-style:square" from="25280,0" to="25280,2098" o:connectortype="straight" o:gfxdata="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" strokecolor="black [3200]" strokeweight=".5pt">
+                  <v:stroke joinstyle="miter"/>
+                </v:line>
+              </v:group>
+            </w:pict>
+          </mc:Fallback>
+        </mc:AlternateContent>
+      </w:r>
+      <w:r>
+        <w:rPr>
+          <w:noProof/>
+        </w:rPr>
+        <mc:AlternateContent>
+          <mc:Choice Requires="wpg">
+            <w:drawing>
+              <wp:anchor distT="0" distB="0" distL="114300" distR="114300" simplePos="0" relativeHeight="251771904" behindDoc="0" locked="0" layoutInCell="1" allowOverlap="1" wp14:anchorId="2493CCF6" wp14:editId="4E561316">
+                <wp:simplePos x="0" y="0"/>
+                <wp:positionH relativeFrom="column">
+                  <wp:posOffset>2082800</wp:posOffset>
+                </wp:positionH>
+                <wp:positionV relativeFrom="paragraph">
+                  <wp:posOffset>6497955</wp:posOffset>
+                </wp:positionV>
+                <wp:extent cx="2940050" cy="209550"/>
+                <wp:effectExtent l="0" t="0" r="19050" b="19050"/>
+                <wp:wrapNone/>
+                <wp:docPr id="2099256106" name="Group 21"/>
+                <wp:cNvGraphicFramePr/>
+                <a:graphic xmlns:a="http://schemas.openxmlformats.org/drawingml/2006/main">
+                  <a:graphicData uri="http://schemas.microsoft.com/office/word/2010/wordprocessingGroup">
+                    <wpg:wgp>
+                      <wpg:cNvGrpSpPr/>
+                      <wpg:grpSpPr>
+                        <a:xfrm>
+                          <a:off x="0" y="0"/>
+                          <a:ext cx="2940050" cy="209550"/>
+                          <a:chOff x="0" y="0"/>
+                          <a:chExt cx="2531533" cy="209825"/>
+                        </a:xfrm>
+                      </wpg:grpSpPr>
+                      <wps:wsp>
+                        <wps:cNvPr id="718968846" name="Straight Connector 18"/>
+                        <wps:cNvCnPr/>
+                        <wps:spPr>
+                          <a:xfrm>
+                            <a:off x="0" y="112466"/>
+                            <a:ext cx="2531533" cy="0"/>
+                          </a:xfrm>
+                          <a:prstGeom prst="line">
+                            <a:avLst/>
+                          </a:prstGeom>
+                        </wps:spPr>
+                        <wps:style>
+                          <a:lnRef idx="1">
+                            <a:schemeClr val="dk1"/>
+                          </a:lnRef>
+                          <a:fillRef idx="0">
+                            <a:schemeClr val="dk1"/>
+                          </a:fillRef>
+                          <a:effectRef idx="0">
+                            <a:schemeClr val="dk1"/>
+                          </a:effectRef>
+                          <a:fontRef idx="minor">
+                            <a:schemeClr val="tx1"/>
+                          </a:fontRef>
+                        </wps:style>
+                        <wps:bodyPr/>
+                      </wps:wsp>
+                      <wps:wsp>
+                        <wps:cNvPr id="704966193" name="Straight Connector 19"/>
+                        <wps:cNvCnPr/>
+                        <wps:spPr>
+                          <a:xfrm>
+                            <a:off x="0" y="0"/>
+                            <a:ext cx="0" cy="209825"/>
+                          </a:xfrm>
+                          <a:prstGeom prst="line">
+                            <a:avLst/>
+                          </a:prstGeom>
+                        </wps:spPr>
+                        <wps:style>
+                          <a:lnRef idx="1">
+                            <a:schemeClr val="dk1"/>
+                          </a:lnRef>
+                          <a:fillRef idx="0">
+                            <a:schemeClr val="dk1"/>
+                          </a:fillRef>
+                          <a:effectRef idx="0">
+                            <a:schemeClr val="dk1"/>
+                          </a:effectRef>
+                          <a:fontRef idx="minor">
+                            <a:schemeClr val="tx1"/>
+                          </a:fontRef>
+                        </wps:style>
+                        <wps:bodyPr/>
+                      </wps:wsp>
+                      <wps:wsp>
+                        <wps:cNvPr id="1893764356" name="Straight Connector 19"/>
+                        <wps:cNvCnPr/>
+                        <wps:spPr>
+                          <a:xfrm>
+                            <a:off x="2528047" y="0"/>
+                            <a:ext cx="0" cy="209825"/>
+                          </a:xfrm>
+                          <a:prstGeom prst="line">
+                            <a:avLst/>
+                          </a:prstGeom>
+                        </wps:spPr>
+                        <wps:style>
+                          <a:lnRef idx="1">
+                            <a:schemeClr val="dk1"/>
+                          </a:lnRef>
+                          <a:fillRef idx="0">
+                            <a:schemeClr val="dk1"/>
+                          </a:fillRef>
+                          <a:effectRef idx="0">
+                            <a:schemeClr val="dk1"/>
+                          </a:effectRef>
+                          <a:fontRef idx="minor">
+                            <a:schemeClr val="tx1"/>
+                          </a:fontRef>
+                        </wps:style>
+                        <wps:bodyPr/>
+                      </wps:wsp>
+                    </wpg:wgp>
+                  </a:graphicData>
+                </a:graphic>
+                <wp14:sizeRelH relativeFrom="margin">
+                  <wp14:pctWidth>0</wp14:pctWidth>
+                </wp14:sizeRelH>
+              </wp:anchor>
+            </w:drawing>
+          </mc:Choice>
+          <mc:Fallback>
+            <w:pict>
+              <v:group w14:anchorId="5284182F" id="Group 21" o:spid="_x0000_s1026" style="position:absolute;margin-left:164pt;margin-top:511.65pt;width:231.5pt;height:16.5pt;z-index:251771904;mso-width-relative:margin" coordsize="25315,2098" o:gfxdata="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">
+                <v:line id="Straight Connector 18" o:spid="_x0000_s1027" style="position:absolute;visibility:visible;mso-wrap-style:square" from="0,1124" to="25315,1124" o:connectortype="straight" o:gfxdata="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" strokecolor="black [3200]" strokeweight=".5pt">
+                  <v:stroke joinstyle="miter"/>
+                </v:line>
+                <v:line id="Straight Connector 19" o:spid="_x0000_s1028" style="position:absolute;visibility:visible;mso-wrap-style:square" from="0,0" to="0,2098" o:connectortype="straight" o:gfxdata="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" strokecolor="black [3200]" strokeweight=".5pt">
+                  <v:stroke joinstyle="miter"/>
+                </v:line>
+                <v:line id="Straight Connector 19" o:spid="_x0000_s1029" style="position:absolute;visibility:visible;mso-wrap-style:square" from="25280,0" to="25280,2098" o:connectortype="straight" o:gfxdata="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" strokecolor="black [3200]" strokeweight=".5pt">
+                  <v:stroke joinstyle="miter"/>
+                </v:line>
+              </v:group>
+            </w:pict>
+          </mc:Fallback>
+        </mc:AlternateContent>
       </w:r>
       <w:r>
         <w:rPr>
@@ -1127,7 +1449,114 @@
         <mc:AlternateContent>
           <mc:Choice Requires="wps">
             <w:drawing>
-              <wp:anchor distT="0" distB="0" distL="114300" distR="114300" simplePos="0" relativeHeight="251714560" behindDoc="0" locked="0" layoutInCell="1" allowOverlap="1" wp14:anchorId="1A9E2FD3" wp14:editId="409E0D70">
+              <wp:anchor distT="0" distB="0" distL="114300" distR="114300" simplePos="0" relativeHeight="251776000" behindDoc="0" locked="0" layoutInCell="1" allowOverlap="1" wp14:anchorId="3558A0A9" wp14:editId="16687B6D">
+                <wp:simplePos x="0" y="0"/>
+                <wp:positionH relativeFrom="column">
+                  <wp:posOffset>3213100</wp:posOffset>
+                </wp:positionH>
+                <wp:positionV relativeFrom="paragraph">
+                  <wp:posOffset>6574155</wp:posOffset>
+                </wp:positionV>
+                <wp:extent cx="698500" cy="239843"/>
+                <wp:effectExtent l="0" t="0" r="0" b="0"/>
+                <wp:wrapNone/>
+                <wp:docPr id="1989155030" name="Text Box 12"/>
+                <wp:cNvGraphicFramePr/>
+                <a:graphic xmlns:a="http://schemas.openxmlformats.org/drawingml/2006/main">
+                  <a:graphicData uri="http://schemas.microsoft.com/office/word/2010/wordprocessingShape">
+                    <wps:wsp>
+                      <wps:cNvSpPr txBox="1"/>
+                      <wps:spPr>
+                        <a:xfrm>
+                          <a:off x="0" y="0"/>
+                          <a:ext cx="698500" cy="239843"/>
+                        </a:xfrm>
+                        <a:prstGeom prst="rect">
+                          <a:avLst/>
+                        </a:prstGeom>
+                        <a:noFill/>
+                        <a:ln w="6350">
+                          <a:noFill/>
+                        </a:ln>
+                      </wps:spPr>
+                      <wps:txbx>
+                        <w:txbxContent>
+                          <w:p>
+                            <w:pPr>
+                              <w:jc w:val="center"/>
+                              <w:rPr>
+                                <w:rFonts w:ascii="Times New Roman" w:hAnsi="Times New Roman" w:cs="Times New Roman"/>
+                                <w:sz w:val="20"/>
+                                <w:szCs w:val="20"/>
+                              </w:rPr>
+                            </w:pPr>
+                            <w:r>
+                              <w:rPr>
+                                <w:rFonts w:ascii="Times New Roman" w:hAnsi="Times New Roman" w:cs="Times New Roman"/>
+                                <w:sz w:val="20"/>
+                                <w:szCs w:val="20"/>
+                              </w:rPr>
+                              <w:t>72.06’</w:t>
+                            </w:r>
+                          </w:p>
+                        </w:txbxContent>
+                      </wps:txbx>
+                      <wps:bodyPr rot="0" spcFirstLastPara="0" vertOverflow="overflow" horzOverflow="overflow" vert="horz" wrap="square" lIns="91440" tIns="45720" rIns="91440" bIns="45720" numCol="1" spcCol="0" rtlCol="0" fromWordArt="0" anchor="t" anchorCtr="0" forceAA="0" compatLnSpc="1">
+                        <a:prstTxWarp prst="textNoShape">
+                          <a:avLst/>
+                        </a:prstTxWarp>
+                        <a:noAutofit/>
+                      </wps:bodyPr>
+                    </wps:wsp>
+                  </a:graphicData>
+                </a:graphic>
+                <wp14:sizeRelH relativeFrom="margin">
+                  <wp14:pctWidth>0</wp14:pctWidth>
+                </wp14:sizeRelH>
+                <wp14:sizeRelV relativeFrom="margin">
+                  <wp14:pctHeight>0</wp14:pctHeight>
+                </wp14:sizeRelV>
+              </wp:anchor>
+            </w:drawing>
+          </mc:Choice>
+          <mc:Fallback>
+            <w:pict>
+              <v:shape w14:anchorId="3558A0A9" id="_x0000_s1029" type="#_x0000_t202" style="position:absolute;left:0;text-align:left;margin-left:253pt;margin-top:517.65pt;width:55pt;height:18.9pt;z-index:251776000;visibility:visible;mso-wrap-style:square;mso-width-percent:0;mso-height-percent:0;mso-wrap-distance-left:9pt;mso-wrap-distance-top:0;mso-wrap-distance-right:9pt;mso-wrap-distance-bottom:0;mso-position-horizontal:absolute;mso-position-horizontal-relative:text;mso-position-vertical:absolute;mso-position-vertical-relative:text;mso-width-percent:0;mso-height-percent:0;mso-width-relative:margin;mso-height-relative:margin;v-text-anchor:top" o:gfxdata="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" filled="f" stroked="f" strokeweight=".5pt">
+                <v:textbox>
+                  <w:txbxContent>
+                    <w:p>
+                      <w:pPr>
+                        <w:jc w:val="center"/>
+                        <w:rPr>
+                          <w:rFonts w:ascii="Times New Roman" w:hAnsi="Times New Roman" w:cs="Times New Roman"/>
+                          <w:sz w:val="20"/>
+                          <w:szCs w:val="20"/>
+                        </w:rPr>
+                      </w:pPr>
+                      <w:r>
+                        <w:rPr>
+                          <w:rFonts w:ascii="Times New Roman" w:hAnsi="Times New Roman" w:cs="Times New Roman"/>
+                          <w:sz w:val="20"/>
+                          <w:szCs w:val="20"/>
+                        </w:rPr>
+                        <w:t>72.06’</w:t>
+                      </w:r>
+                    </w:p>
+                  </w:txbxContent>
+                </v:textbox>
+              </v:shape>
+            </w:pict>
+          </mc:Fallback>
+        </mc:AlternateContent>
+      </w:r>
+      <w:r>
+        <w:rPr>
+          <w:noProof/>
+        </w:rPr>
+        <mc:AlternateContent>
+          <mc:Choice Requires="wps">
+            <w:drawing>
+              <wp:anchor distT="0" distB="0" distL="114300" distR="114300" simplePos="0" relativeHeight="251713536" behindDoc="0" locked="0" layoutInCell="1" allowOverlap="1" wp14:anchorId="1A9E2FD3" wp14:editId="6A19AC12">
                 <wp:simplePos x="0" y="0"/>
                 <wp:positionH relativeFrom="column">
                   <wp:posOffset>3368040</wp:posOffset>
@@ -1203,7 +1632,7 @@
           </mc:Choice>
           <mc:Fallback>
             <w:pict>
-              <v:shape w14:anchorId="1A9E2FD3" id="Text Box 12" o:spid="_x0000_s1028" type="#_x0000_t202" style="position:absolute;left:0;text-align:left;margin-left:265.2pt;margin-top:408pt;width:28.1pt;height:18.85pt;z-index:251714560;visibility:visible;mso-wrap-style:square;mso-width-percent:0;mso-height-percent:0;mso-wrap-distance-left:9pt;mso-wrap-distance-top:0;mso-wrap-distance-right:9pt;mso-wrap-distance-bottom:0;mso-position-horizontal:absolute;mso-position-horizontal-relative:text;mso-position-vertical:absolute;mso-position-vertical-relative:text;mso-width-percent:0;mso-height-percent:0;mso-width-relative:margin;mso-height-relative:margin;v-text-anchor:top" o:gfxdata="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" filled="f" stroked="f" strokeweight=".5pt">
+              <v:shape w14:anchorId="1A9E2FD3" id="_x0000_s1030" type="#_x0000_t202" style="position:absolute;left:0;text-align:left;margin-left:265.2pt;margin-top:408pt;width:28.1pt;height:18.85pt;z-index:251713536;visibility:visible;mso-wrap-style:square;mso-width-percent:0;mso-height-percent:0;mso-wrap-distance-left:9pt;mso-wrap-distance-top:0;mso-wrap-distance-right:9pt;mso-wrap-distance-bottom:0;mso-position-horizontal:absolute;mso-position-horizontal-relative:text;mso-position-vertical:absolute;mso-position-vertical-relative:text;mso-width-percent:0;mso-height-percent:0;mso-width-relative:margin;mso-height-relative:margin;v-text-anchor:top" o:gfxdata="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" filled="f" stroked="f" strokeweight=".5pt">
                 <v:textbox>
                   <w:txbxContent>
                     <w:p>
@@ -1242,7 +1671,7 @@
         <mc:AlternateContent>
           <mc:Choice Requires="wps">
             <w:drawing>
-              <wp:anchor distT="0" distB="0" distL="114300" distR="114300" simplePos="0" relativeHeight="251712512" behindDoc="0" locked="0" layoutInCell="1" allowOverlap="1" wp14:anchorId="1A9E2FD3" wp14:editId="79CAEDA7">
+              <wp:anchor distT="0" distB="0" distL="114300" distR="114300" simplePos="0" relativeHeight="251711488" behindDoc="0" locked="0" layoutInCell="1" allowOverlap="1" wp14:anchorId="1A9E2FD3" wp14:editId="75EB1F61">
                 <wp:simplePos x="0" y="0"/>
                 <wp:positionH relativeFrom="column">
                   <wp:posOffset>3369310</wp:posOffset>
@@ -1318,7 +1747,7 @@
           </mc:Choice>
           <mc:Fallback>
             <w:pict>
-              <v:shape w14:anchorId="1A9E2FD3" id="_x0000_s1029" type="#_x0000_t202" style="position:absolute;left:0;text-align:left;margin-left:265.3pt;margin-top:360.85pt;width:27.5pt;height:18.85pt;z-index:251712512;visibility:visible;mso-wrap-style:square;mso-width-percent:0;mso-height-percent:0;mso-wrap-distance-left:9pt;mso-wrap-distance-top:0;mso-wrap-distance-right:9pt;mso-wrap-distance-bottom:0;mso-position-horizontal:absolute;mso-position-horizontal-relative:text;mso-position-vertical:absolute;mso-position-vertical-relative:text;mso-width-percent:0;mso-height-percent:0;mso-width-relative:margin;mso-height-relative:margin;v-text-anchor:top" o:gfxdata="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" filled="f" stroked="f" strokeweight=".5pt">
+              <v:shape w14:anchorId="1A9E2FD3" id="_x0000_s1031" type="#_x0000_t202" style="position:absolute;left:0;text-align:left;margin-left:265.3pt;margin-top:360.85pt;width:27.5pt;height:18.85pt;z-index:251711488;visibility:visible;mso-wrap-style:square;mso-width-percent:0;mso-height-percent:0;mso-wrap-distance-left:9pt;mso-wrap-distance-top:0;mso-wrap-distance-right:9pt;mso-wrap-distance-bottom:0;mso-position-horizontal:absolute;mso-position-horizontal-relative:text;mso-position-vertical:absolute;mso-position-vertical-relative:text;mso-width-percent:0;mso-height-percent:0;mso-width-relative:margin;mso-height-relative:margin;v-text-anchor:top" o:gfxdata="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" filled="f" stroked="f" strokeweight=".5pt">
                 <v:textbox>
                   <w:txbxContent>
                     <w:p>
@@ -1357,7 +1786,7 @@
         <mc:AlternateContent>
           <mc:Choice Requires="wps">
             <w:drawing>
-              <wp:anchor distT="0" distB="0" distL="114300" distR="114300" simplePos="0" relativeHeight="251710464" behindDoc="0" locked="0" layoutInCell="1" allowOverlap="1" wp14:anchorId="2EB2C3F6" wp14:editId="3BDFF1D4">
+              <wp:anchor distT="0" distB="0" distL="114300" distR="114300" simplePos="0" relativeHeight="251709440" behindDoc="0" locked="0" layoutInCell="1" allowOverlap="1" wp14:anchorId="2EB2C3F6" wp14:editId="4AAB0C9D">
                 <wp:simplePos x="0" y="0"/>
                 <wp:positionH relativeFrom="column">
                   <wp:posOffset>3363505</wp:posOffset>
@@ -1433,7 +1862,7 @@
           </mc:Choice>
           <mc:Fallback>
             <w:pict>
-              <v:shape w14:anchorId="2EB2C3F6" id="_x0000_s1030" type="#_x0000_t202" style="position:absolute;left:0;text-align:left;margin-left:264.85pt;margin-top:309.6pt;width:27.5pt;height:18.85pt;z-index:251710464;visibility:visible;mso-wrap-style:square;mso-width-percent:0;mso-height-percent:0;mso-wrap-distance-left:9pt;mso-wrap-distance-top:0;mso-wrap-distance-right:9pt;mso-wrap-distance-bottom:0;mso-position-horizontal:absolute;mso-position-horizontal-relative:text;mso-position-vertical:absolute;mso-position-vertical-relative:text;mso-width-percent:0;mso-height-percent:0;mso-width-relative:margin;mso-height-relative:margin;v-text-anchor:top" o:gfxdata="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" filled="f" stroked="f" strokeweight=".5pt">
+              <v:shape w14:anchorId="2EB2C3F6" id="_x0000_s1032" type="#_x0000_t202" style="position:absolute;left:0;text-align:left;margin-left:264.85pt;margin-top:309.6pt;width:27.5pt;height:18.85pt;z-index:251709440;visibility:visible;mso-wrap-style:square;mso-width-percent:0;mso-height-percent:0;mso-wrap-distance-left:9pt;mso-wrap-distance-top:0;mso-wrap-distance-right:9pt;mso-wrap-distance-bottom:0;mso-position-horizontal:absolute;mso-position-horizontal-relative:text;mso-position-vertical:absolute;mso-position-vertical-relative:text;mso-width-percent:0;mso-height-percent:0;mso-width-relative:margin;mso-height-relative:margin;v-text-anchor:top" o:gfxdata="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" filled="f" stroked="f" strokeweight=".5pt">
                 <v:textbox>
                   <w:txbxContent>
                     <w:p>
@@ -1472,7 +1901,7 @@
         <mc:AlternateContent>
           <mc:Choice Requires="wps">
             <w:drawing>
-              <wp:anchor distT="0" distB="0" distL="114300" distR="114300" simplePos="0" relativeHeight="251716608" behindDoc="0" locked="0" layoutInCell="1" allowOverlap="1" wp14:anchorId="1A9E2FD3" wp14:editId="4CD1F571">
+              <wp:anchor distT="0" distB="0" distL="114300" distR="114300" simplePos="0" relativeHeight="251715584" behindDoc="0" locked="0" layoutInCell="1" allowOverlap="1" wp14:anchorId="1A9E2FD3" wp14:editId="5FA8A870">
                 <wp:simplePos x="0" y="0"/>
                 <wp:positionH relativeFrom="column">
                   <wp:posOffset>3371158</wp:posOffset>
@@ -1548,7 +1977,7 @@
           </mc:Choice>
           <mc:Fallback>
             <w:pict>
-              <v:shape w14:anchorId="1A9E2FD3" id="_x0000_s1031" type="#_x0000_t202" style="position:absolute;left:0;text-align:left;margin-left:265.45pt;margin-top:454.2pt;width:27.55pt;height:18.9pt;z-index:251716608;visibility:visible;mso-wrap-style:square;mso-width-percent:0;mso-height-percent:0;mso-wrap-distance-left:9pt;mso-wrap-distance-top:0;mso-wrap-distance-right:9pt;mso-wrap-distance-bottom:0;mso-position-horizontal:absolute;mso-position-horizontal-relative:text;mso-position-vertical:absolute;mso-position-vertical-relative:text;mso-width-percent:0;mso-height-percent:0;mso-width-relative:margin;mso-height-relative:margin;v-text-anchor:top" o:gfxdata="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" filled="f" stroked="f" strokeweight=".5pt">
+              <v:shape w14:anchorId="1A9E2FD3" id="_x0000_s1033" type="#_x0000_t202" style="position:absolute;left:0;text-align:left;margin-left:265.45pt;margin-top:454.2pt;width:27.55pt;height:18.9pt;z-index:251715584;visibility:visible;mso-wrap-style:square;mso-width-percent:0;mso-height-percent:0;mso-wrap-distance-left:9pt;mso-wrap-distance-top:0;mso-wrap-distance-right:9pt;mso-wrap-distance-bottom:0;mso-position-horizontal:absolute;mso-position-horizontal-relative:text;mso-position-vertical:absolute;mso-position-vertical-relative:text;mso-width-percent:0;mso-height-percent:0;mso-width-relative:margin;mso-height-relative:margin;v-text-anchor:top" o:gfxdata="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" filled="f" stroked="f" strokeweight=".5pt">
                 <v:textbox>
                   <w:txbxContent>
                     <w:p>
@@ -1587,7 +2016,7 @@
         <mc:AlternateContent>
           <mc:Choice Requires="wps">
             <w:drawing>
-              <wp:anchor distT="0" distB="0" distL="114300" distR="114300" simplePos="0" relativeHeight="251718656" behindDoc="0" locked="0" layoutInCell="1" allowOverlap="1" wp14:anchorId="1A9E2FD3" wp14:editId="1CA730DF">
+              <wp:anchor distT="0" distB="0" distL="114300" distR="114300" simplePos="0" relativeHeight="251717632" behindDoc="0" locked="0" layoutInCell="1" allowOverlap="1" wp14:anchorId="1A9E2FD3" wp14:editId="6452BB62">
                 <wp:simplePos x="0" y="0"/>
                 <wp:positionH relativeFrom="column">
                   <wp:posOffset>2223014</wp:posOffset>
@@ -1663,7 +2092,7 @@
           </mc:Choice>
           <mc:Fallback>
             <w:pict>
-              <v:shape w14:anchorId="1A9E2FD3" id="_x0000_s1032" type="#_x0000_t202" style="position:absolute;left:0;text-align:left;margin-left:175.05pt;margin-top:304.95pt;width:27.55pt;height:18.9pt;z-index:251718656;visibility:visible;mso-wrap-style:square;mso-width-percent:0;mso-height-percent:0;mso-wrap-distance-left:9pt;mso-wrap-distance-top:0;mso-wrap-distance-right:9pt;mso-wrap-distance-bottom:0;mso-position-horizontal:absolute;mso-position-horizontal-relative:text;mso-position-vertical:absolute;mso-position-vertical-relative:text;mso-width-percent:0;mso-height-percent:0;mso-width-relative:margin;mso-height-relative:margin;v-text-anchor:top" o:gfxdata="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" filled="f" stroked="f" strokeweight=".5pt">
+              <v:shape w14:anchorId="1A9E2FD3" id="_x0000_s1034" type="#_x0000_t202" style="position:absolute;left:0;text-align:left;margin-left:175.05pt;margin-top:304.95pt;width:27.55pt;height:18.9pt;z-index:251717632;visibility:visible;mso-wrap-style:square;mso-width-percent:0;mso-height-percent:0;mso-wrap-distance-left:9pt;mso-wrap-distance-top:0;mso-wrap-distance-right:9pt;mso-wrap-distance-bottom:0;mso-position-horizontal:absolute;mso-position-horizontal-relative:text;mso-position-vertical:absolute;mso-position-vertical-relative:text;mso-width-percent:0;mso-height-percent:0;mso-width-relative:margin;mso-height-relative:margin;v-text-anchor:top" o:gfxdata="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" filled="f" stroked="f" strokeweight=".5pt">
                 <v:textbox>
                   <w:txbxContent>
                     <w:p>
@@ -1702,7 +2131,7 @@
         <mc:AlternateContent>
           <mc:Choice Requires="wps">
             <w:drawing>
-              <wp:anchor distT="0" distB="0" distL="114300" distR="114300" simplePos="0" relativeHeight="251767808" behindDoc="0" locked="0" layoutInCell="1" allowOverlap="1" wp14:anchorId="791B8783" wp14:editId="4C4A8A99">
+              <wp:anchor distT="0" distB="0" distL="114300" distR="114300" simplePos="0" relativeHeight="251766784" behindDoc="0" locked="0" layoutInCell="1" allowOverlap="1" wp14:anchorId="791B8783" wp14:editId="285B85DC">
                 <wp:simplePos x="0" y="0"/>
                 <wp:positionH relativeFrom="column">
                   <wp:posOffset>4548175</wp:posOffset>
@@ -1778,7 +2207,7 @@
           </mc:Choice>
           <mc:Fallback>
             <w:pict>
-              <v:shape w14:anchorId="791B8783" id="_x0000_s1033" type="#_x0000_t202" style="position:absolute;left:0;text-align:left;margin-left:358.1pt;margin-top:302.05pt;width:27.55pt;height:18.9pt;z-index:251767808;visibility:visible;mso-wrap-style:square;mso-width-percent:0;mso-height-percent:0;mso-wrap-distance-left:9pt;mso-wrap-distance-top:0;mso-wrap-distance-right:9pt;mso-wrap-distance-bottom:0;mso-position-horizontal:absolute;mso-position-horizontal-relative:text;mso-position-vertical:absolute;mso-position-vertical-relative:text;mso-width-percent:0;mso-height-percent:0;mso-width-relative:margin;mso-height-relative:margin;v-text-anchor:top" o:gfxdata="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" filled="f" stroked="f" strokeweight=".5pt">
+              <v:shape w14:anchorId="791B8783" id="_x0000_s1035" type="#_x0000_t202" style="position:absolute;left:0;text-align:left;margin-left:358.1pt;margin-top:302.05pt;width:27.55pt;height:18.9pt;z-index:251766784;visibility:visible;mso-wrap-style:square;mso-width-percent:0;mso-height-percent:0;mso-wrap-distance-left:9pt;mso-wrap-distance-top:0;mso-wrap-distance-right:9pt;mso-wrap-distance-bottom:0;mso-position-horizontal:absolute;mso-position-horizontal-relative:text;mso-position-vertical:absolute;mso-position-vertical-relative:text;mso-width-percent:0;mso-height-percent:0;mso-width-relative:margin;mso-height-relative:margin;v-text-anchor:top" o:gfxdata="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" filled="f" stroked="f" strokeweight=".5pt">
                 <v:textbox>
                   <w:txbxContent>
                     <w:p>
@@ -1817,7 +2246,7 @@
         <mc:AlternateContent>
           <mc:Choice Requires="wps">
             <w:drawing>
-              <wp:anchor distT="0" distB="0" distL="114300" distR="114300" simplePos="0" relativeHeight="251765760" behindDoc="0" locked="0" layoutInCell="1" allowOverlap="1" wp14:anchorId="2FA6E2FB" wp14:editId="7A7D502B">
+              <wp:anchor distT="0" distB="0" distL="114300" distR="114300" simplePos="0" relativeHeight="251764736" behindDoc="0" locked="0" layoutInCell="1" allowOverlap="1" wp14:anchorId="2FA6E2FB" wp14:editId="6C3E2D44">
                 <wp:simplePos x="0" y="0"/>
                 <wp:positionH relativeFrom="column">
                   <wp:posOffset>3420745</wp:posOffset>
@@ -1891,7 +2320,7 @@
           </mc:Choice>
           <mc:Fallback>
             <w:pict>
-              <v:shape w14:anchorId="755F4B67" id="Multiply 32" o:spid="_x0000_s1026" style="position:absolute;margin-left:269.35pt;margin-top:393pt;width:18.6pt;height:18.95pt;z-index:251765760;visibility:visible;mso-wrap-style:square;mso-width-percent:0;mso-height-percent:0;mso-wrap-distance-left:9pt;mso-wrap-distance-top:0;mso-wrap-distance-right:9pt;mso-wrap-distance-bottom:0;mso-position-horizontal:absolute;mso-position-horizontal-relative:text;mso-position-vertical:absolute;mso-position-vertical-relative:text;mso-width-percent:0;mso-height-percent:0;mso-width-relative:margin;mso-height-relative:margin;v-text-anchor:middle" coordsize="236418,240780" o:gfxdata="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" path="m45379,69026l68185,46633r50024,50947l168233,46633r22806,22393l140605,120390r50434,51364l168233,194147,118209,143200,68185,194147,45379,171754,95813,120390,45379,69026xe" fillcolor="#747070 [1614]" strokecolor="black [3213]" strokeweight="1pt">
+              <v:shape w14:anchorId="6CB340BF" id="Multiply 32" o:spid="_x0000_s1026" style="position:absolute;margin-left:269.35pt;margin-top:393pt;width:18.6pt;height:18.95pt;z-index:251764736;visibility:visible;mso-wrap-style:square;mso-width-percent:0;mso-height-percent:0;mso-wrap-distance-left:9pt;mso-wrap-distance-top:0;mso-wrap-distance-right:9pt;mso-wrap-distance-bottom:0;mso-position-horizontal:absolute;mso-position-horizontal-relative:text;mso-position-vertical:absolute;mso-position-vertical-relative:text;mso-width-percent:0;mso-height-percent:0;mso-width-relative:margin;mso-height-relative:margin;v-text-anchor:middle" coordsize="236418,240780" o:gfxdata="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" path="m45379,69026l68185,46633r50024,50947l168233,46633r22806,22393l140605,120390r50434,51364l168233,194147,118209,143200,68185,194147,45379,171754,95813,120390,45379,69026xe" fillcolor="#747070 [1614]" strokecolor="black [3213]" strokeweight="1pt">
                 <v:stroke joinstyle="miter"/>
                 <v:path arrowok="t" o:connecttype="custom" o:connectlocs="45379,69026;68185,46633;118209,97580;168233,46633;191039,69026;140605,120390;191039,171754;168233,194147;118209,143200;68185,194147;45379,171754;95813,120390;45379,69026" o:connectangles="0,0,0,0,0,0,0,0,0,0,0,0,0"/>
               </v:shape>
@@ -1906,7 +2335,7 @@
         <mc:AlternateContent>
           <mc:Choice Requires="wps">
             <w:drawing>
-              <wp:anchor distT="0" distB="0" distL="114300" distR="114300" simplePos="0" relativeHeight="251706368" behindDoc="0" locked="0" layoutInCell="1" allowOverlap="1" wp14:anchorId="2C4AA0B2" wp14:editId="1E806C94">
+              <wp:anchor distT="0" distB="0" distL="114300" distR="114300" simplePos="0" relativeHeight="251705344" behindDoc="0" locked="0" layoutInCell="1" allowOverlap="1" wp14:anchorId="2C4AA0B2" wp14:editId="295D08C1">
                 <wp:simplePos x="0" y="0"/>
                 <wp:positionH relativeFrom="column">
                   <wp:posOffset>3415665</wp:posOffset>
@@ -1980,7 +2409,7 @@
           </mc:Choice>
           <mc:Fallback>
             <w:pict>
-              <v:shape w14:anchorId="27D0EE7A" id="Multiply 32" o:spid="_x0000_s1026" style="position:absolute;margin-left:268.95pt;margin-top:345.8pt;width:18.6pt;height:18.95pt;z-index:251706368;visibility:visible;mso-wrap-style:square;mso-width-percent:0;mso-height-percent:0;mso-wrap-distance-left:9pt;mso-wrap-distance-top:0;mso-wrap-distance-right:9pt;mso-wrap-distance-bottom:0;mso-position-horizontal:absolute;mso-position-horizontal-relative:text;mso-position-vertical:absolute;mso-position-vertical-relative:text;mso-width-percent:0;mso-height-percent:0;mso-width-relative:margin;mso-height-relative:margin;v-text-anchor:middle" coordsize="236418,240780" o:gfxdata="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" path="m45379,69026l68185,46633r50024,50947l168233,46633r22806,22393l140605,120390r50434,51364l168233,194147,118209,143200,68185,194147,45379,171754,95813,120390,45379,69026xe" fillcolor="#747070 [1614]" strokecolor="black [3213]" strokeweight="1pt">
+              <v:shape w14:anchorId="499BFFE4" id="Multiply 32" o:spid="_x0000_s1026" style="position:absolute;margin-left:268.95pt;margin-top:345.8pt;width:18.6pt;height:18.95pt;z-index:251705344;visibility:visible;mso-wrap-style:square;mso-width-percent:0;mso-height-percent:0;mso-wrap-distance-left:9pt;mso-wrap-distance-top:0;mso-wrap-distance-right:9pt;mso-wrap-distance-bottom:0;mso-position-horizontal:absolute;mso-position-horizontal-relative:text;mso-position-vertical:absolute;mso-position-vertical-relative:text;mso-width-percent:0;mso-height-percent:0;mso-width-relative:margin;mso-height-relative:margin;v-text-anchor:middle" coordsize="236418,240780" o:gfxdata="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" path="m45379,69026l68185,46633r50024,50947l168233,46633r22806,22393l140605,120390r50434,51364l168233,194147,118209,143200,68185,194147,45379,171754,95813,120390,45379,69026xe" fillcolor="#747070 [1614]" strokecolor="black [3213]" strokeweight="1pt">
                 <v:stroke joinstyle="miter"/>
                 <v:path arrowok="t" o:connecttype="custom" o:connectlocs="45379,69026;68185,46633;118209,97580;168233,46633;191039,69026;140605,120390;191039,171754;168233,194147;118209,143200;68185,194147;45379,171754;95813,120390;45379,69026" o:connectangles="0,0,0,0,0,0,0,0,0,0,0,0,0"/>
               </v:shape>
@@ -1995,7 +2424,7 @@
         <mc:AlternateContent>
           <mc:Choice Requires="wps">
             <w:drawing>
-              <wp:anchor distT="0" distB="0" distL="114300" distR="114300" simplePos="0" relativeHeight="251702272" behindDoc="0" locked="0" layoutInCell="1" allowOverlap="1" wp14:anchorId="2C4AA0B2" wp14:editId="26E10411">
+              <wp:anchor distT="0" distB="0" distL="114300" distR="114300" simplePos="0" relativeHeight="251701248" behindDoc="0" locked="0" layoutInCell="1" allowOverlap="1" wp14:anchorId="2C4AA0B2" wp14:editId="1F12A552">
                 <wp:simplePos x="0" y="0"/>
                 <wp:positionH relativeFrom="column">
                   <wp:posOffset>3412145</wp:posOffset>
@@ -2069,7 +2498,7 @@
           </mc:Choice>
           <mc:Fallback>
             <w:pict>
-              <v:shape w14:anchorId="45CEA71B" id="Multiply 32" o:spid="_x0000_s1026" style="position:absolute;margin-left:268.65pt;margin-top:295.5pt;width:18.6pt;height:18.95pt;z-index:251702272;visibility:visible;mso-wrap-style:square;mso-width-percent:0;mso-height-percent:0;mso-wrap-distance-left:9pt;mso-wrap-distance-top:0;mso-wrap-distance-right:9pt;mso-wrap-distance-bottom:0;mso-position-horizontal:absolute;mso-position-horizontal-relative:text;mso-position-vertical:absolute;mso-position-vertical-relative:text;mso-width-percent:0;mso-height-percent:0;mso-width-relative:margin;mso-height-relative:margin;v-text-anchor:middle" coordsize="236220,240665" o:gfxdata="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" path="m45339,68987l68129,46617r49981,50921l168091,46617r22790,22370l140484,120333r50397,51345l168091,194048,118110,143127,68129,194048,45339,171678,95736,120333,45339,68987xe" fillcolor="#747070 [1614]" strokecolor="black [3213]" strokeweight="1pt">
+              <v:shape w14:anchorId="163108A1" id="Multiply 32" o:spid="_x0000_s1026" style="position:absolute;margin-left:268.65pt;margin-top:295.5pt;width:18.6pt;height:18.95pt;z-index:251701248;visibility:visible;mso-wrap-style:square;mso-width-percent:0;mso-height-percent:0;mso-wrap-distance-left:9pt;mso-wrap-distance-top:0;mso-wrap-distance-right:9pt;mso-wrap-distance-bottom:0;mso-position-horizontal:absolute;mso-position-horizontal-relative:text;mso-position-vertical:absolute;mso-position-vertical-relative:text;mso-width-percent:0;mso-height-percent:0;mso-width-relative:margin;mso-height-relative:margin;v-text-anchor:middle" coordsize="236220,240665" o:gfxdata="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" path="m45339,68987l68129,46617r49981,50921l168091,46617r22790,22370l140484,120333r50397,51345l168091,194048,118110,143127,68129,194048,45339,171678,95736,120333,45339,68987xe" fillcolor="#747070 [1614]" strokecolor="black [3213]" strokeweight="1pt">
                 <v:stroke joinstyle="miter"/>
                 <v:path arrowok="t" o:connecttype="custom" o:connectlocs="45339,68987;68129,46617;118110,97538;168091,46617;190881,68987;140484,120333;190881,171678;168091,194048;118110,143127;68129,194048;45339,171678;95736,120333;45339,68987" o:connectangles="0,0,0,0,0,0,0,0,0,0,0,0,0"/>
               </v:shape>
@@ -2084,7 +2513,7 @@
         <mc:AlternateContent>
           <mc:Choice Requires="wps">
             <w:drawing>
-              <wp:anchor distT="0" distB="0" distL="114300" distR="114300" simplePos="0" relativeHeight="251708416" behindDoc="0" locked="0" layoutInCell="1" allowOverlap="1" wp14:anchorId="2C4AA0B2" wp14:editId="24C5A47C">
+              <wp:anchor distT="0" distB="0" distL="114300" distR="114300" simplePos="0" relativeHeight="251707392" behindDoc="0" locked="0" layoutInCell="1" allowOverlap="1" wp14:anchorId="2C4AA0B2" wp14:editId="71259AA8">
                 <wp:simplePos x="0" y="0"/>
                 <wp:positionH relativeFrom="column">
                   <wp:posOffset>3412852</wp:posOffset>
@@ -2158,7 +2587,7 @@
           </mc:Choice>
           <mc:Fallback>
             <w:pict>
-              <v:shape w14:anchorId="1F2A6AB5" id="Multiply 32" o:spid="_x0000_s1026" style="position:absolute;margin-left:268.75pt;margin-top:442.15pt;width:18.6pt;height:18.95pt;z-index:251708416;visibility:visible;mso-wrap-style:square;mso-width-percent:0;mso-height-percent:0;mso-wrap-distance-left:9pt;mso-wrap-distance-top:0;mso-wrap-distance-right:9pt;mso-wrap-distance-bottom:0;mso-position-horizontal:absolute;mso-position-horizontal-relative:text;mso-position-vertical:absolute;mso-position-vertical-relative:text;mso-width-percent:0;mso-height-percent:0;mso-width-relative:margin;mso-height-relative:margin;v-text-anchor:middle" coordsize="236418,240780" o:gfxdata="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" path="m45379,69026l68185,46633r50024,50947l168233,46633r22806,22393l140605,120390r50434,51364l168233,194147,118209,143200,68185,194147,45379,171754,95813,120390,45379,69026xe" fillcolor="#747070 [1614]" strokecolor="black [3213]" strokeweight="1pt">
+              <v:shape w14:anchorId="5555E416" id="Multiply 32" o:spid="_x0000_s1026" style="position:absolute;margin-left:268.75pt;margin-top:442.15pt;width:18.6pt;height:18.95pt;z-index:251707392;visibility:visible;mso-wrap-style:square;mso-width-percent:0;mso-height-percent:0;mso-wrap-distance-left:9pt;mso-wrap-distance-top:0;mso-wrap-distance-right:9pt;mso-wrap-distance-bottom:0;mso-position-horizontal:absolute;mso-position-horizontal-relative:text;mso-position-vertical:absolute;mso-position-vertical-relative:text;mso-width-percent:0;mso-height-percent:0;mso-width-relative:margin;mso-height-relative:margin;v-text-anchor:middle" coordsize="236418,240780" o:gfxdata="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" path="m45379,69026l68185,46633r50024,50947l168233,46633r22806,22393l140605,120390r50434,51364l168233,194147,118209,143200,68185,194147,45379,171754,95813,120390,45379,69026xe" fillcolor="#747070 [1614]" strokecolor="black [3213]" strokeweight="1pt">
                 <v:stroke joinstyle="miter"/>
                 <v:path arrowok="t" o:connecttype="custom" o:connectlocs="45379,69026;68185,46633;118209,97580;168233,46633;191039,69026;140605,120390;191039,171754;168233,194147;118209,143200;68185,194147;45379,171754;95813,120390;45379,69026" o:connectangles="0,0,0,0,0,0,0,0,0,0,0,0,0"/>
               </v:shape>
@@ -2173,7 +2602,7 @@
         <mc:AlternateContent>
           <mc:Choice Requires="wps">
             <w:drawing>
-              <wp:anchor distT="0" distB="0" distL="114300" distR="114300" simplePos="0" relativeHeight="251691008" behindDoc="0" locked="0" layoutInCell="1" allowOverlap="1" wp14:anchorId="634395C8" wp14:editId="4FED92A4">
+              <wp:anchor distT="0" distB="0" distL="114300" distR="114300" simplePos="0" relativeHeight="251689984" behindDoc="0" locked="0" layoutInCell="1" allowOverlap="1" wp14:anchorId="634395C8" wp14:editId="4AF390CB">
                 <wp:simplePos x="0" y="0"/>
                 <wp:positionH relativeFrom="column">
                   <wp:posOffset>3296727</wp:posOffset>
@@ -2265,7 +2694,7 @@
           </mc:Choice>
           <mc:Fallback>
             <w:pict>
-              <v:oval w14:anchorId="700C813B" id="Oval 24" o:spid="_x0000_s1026" style="position:absolute;margin-left:259.6pt;margin-top:225.8pt;width:10.2pt;height:10.35pt;z-index:251691008;visibility:visible;mso-wrap-style:square;mso-width-percent:0;mso-height-percent:0;mso-wrap-distance-left:9pt;mso-wrap-distance-top:0;mso-wrap-distance-right:9pt;mso-wrap-distance-bottom:0;mso-position-horizontal:absolute;mso-position-horizontal-relative:text;mso-position-vertical:absolute;mso-position-vertical-relative:text;mso-width-percent:0;mso-height-percent:0;mso-width-relative:margin;mso-height-relative:margin;v-text-anchor:middle" o:gfxdata="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" fillcolor="white [22]" strokecolor="black [3213]" strokeweight="1pt">
+              <v:oval w14:anchorId="0395D170" id="Oval 24" o:spid="_x0000_s1026" style="position:absolute;margin-left:259.6pt;margin-top:225.8pt;width:10.2pt;height:10.35pt;z-index:251689984;visibility:visible;mso-wrap-style:square;mso-width-percent:0;mso-height-percent:0;mso-wrap-distance-left:9pt;mso-wrap-distance-top:0;mso-wrap-distance-right:9pt;mso-wrap-distance-bottom:0;mso-position-horizontal:absolute;mso-position-horizontal-relative:text;mso-position-vertical:absolute;mso-position-vertical-relative:text;mso-width-percent:0;mso-height-percent:0;mso-width-relative:margin;mso-height-relative:margin;v-text-anchor:middle" o:gfxdata="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" fillcolor="white [22]" strokecolor="black [3213]" strokeweight="1pt">
                 <v:fill color2="#a5a5a5 [3206]" rotate="t" focusposition=".5,-52429f" focussize="" colors="0 white;22938f white;1 #a5a5a5" focus="100%" type="gradientRadial"/>
                 <v:stroke joinstyle="miter"/>
               </v:oval>
@@ -2280,7 +2709,7 @@
         <mc:AlternateContent>
           <mc:Choice Requires="wps">
             <w:drawing>
-              <wp:anchor distT="0" distB="0" distL="114300" distR="114300" simplePos="0" relativeHeight="251688960" behindDoc="0" locked="0" layoutInCell="1" allowOverlap="1" wp14:anchorId="634395C8" wp14:editId="37AB734C">
+              <wp:anchor distT="0" distB="0" distL="114300" distR="114300" simplePos="0" relativeHeight="251687936" behindDoc="0" locked="0" layoutInCell="1" allowOverlap="1" wp14:anchorId="634395C8" wp14:editId="3C3150BF">
                 <wp:simplePos x="0" y="0"/>
                 <wp:positionH relativeFrom="column">
                   <wp:posOffset>3620666</wp:posOffset>
@@ -2372,7 +2801,7 @@
           </mc:Choice>
           <mc:Fallback>
             <w:pict>
-              <v:oval w14:anchorId="792605B1" id="Oval 24" o:spid="_x0000_s1026" style="position:absolute;margin-left:285.1pt;margin-top:226.1pt;width:10.2pt;height:10.35pt;z-index:251688960;visibility:visible;mso-wrap-style:square;mso-width-percent:0;mso-height-percent:0;mso-wrap-distance-left:9pt;mso-wrap-distance-top:0;mso-wrap-distance-right:9pt;mso-wrap-distance-bottom:0;mso-position-horizontal:absolute;mso-position-horizontal-relative:text;mso-position-vertical:absolute;mso-position-vertical-relative:text;mso-width-percent:0;mso-height-percent:0;mso-width-relative:margin;mso-height-relative:margin;v-text-anchor:middle" o:gfxdata="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" fillcolor="white [22]" strokecolor="black [3213]" strokeweight="1pt">
+              <v:oval w14:anchorId="2DDC26E9" id="Oval 24" o:spid="_x0000_s1026" style="position:absolute;margin-left:285.1pt;margin-top:226.1pt;width:10.2pt;height:10.35pt;z-index:251687936;visibility:visible;mso-wrap-style:square;mso-width-percent:0;mso-height-percent:0;mso-wrap-distance-left:9pt;mso-wrap-distance-top:0;mso-wrap-distance-right:9pt;mso-wrap-distance-bottom:0;mso-position-horizontal:absolute;mso-position-horizontal-relative:text;mso-position-vertical:absolute;mso-position-vertical-relative:text;mso-width-percent:0;mso-height-percent:0;mso-width-relative:margin;mso-height-relative:margin;v-text-anchor:middle" o:gfxdata="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" fillcolor="white [22]" strokecolor="black [3213]" strokeweight="1pt">
                 <v:fill color2="#a5a5a5 [3206]" rotate="t" focusposition=".5,-52429f" focussize="" colors="0 white;22938f white;1 #a5a5a5" focus="100%" type="gradientRadial"/>
                 <v:stroke joinstyle="miter"/>
               </v:oval>
@@ -2387,7 +2816,7 @@
         <mc:AlternateContent>
           <mc:Choice Requires="wps">
             <w:drawing>
-              <wp:anchor distT="0" distB="0" distL="114300" distR="114300" simplePos="0" relativeHeight="251694080" behindDoc="0" locked="0" layoutInCell="1" allowOverlap="1" wp14:anchorId="3E8D61B0" wp14:editId="3965FE7C">
+              <wp:anchor distT="0" distB="0" distL="114300" distR="114300" simplePos="0" relativeHeight="251693056" behindDoc="0" locked="0" layoutInCell="1" allowOverlap="1" wp14:anchorId="3E8D61B0" wp14:editId="0168E460">
                 <wp:simplePos x="0" y="0"/>
                 <wp:positionH relativeFrom="column">
                   <wp:posOffset>3460284</wp:posOffset>
@@ -2479,7 +2908,7 @@
           </mc:Choice>
           <mc:Fallback>
             <w:pict>
-              <v:oval w14:anchorId="7A834468" id="Oval 24" o:spid="_x0000_s1026" style="position:absolute;margin-left:272.45pt;margin-top:226.1pt;width:10.2pt;height:10.4pt;z-index:251694080;visibility:visible;mso-wrap-style:square;mso-width-percent:0;mso-height-percent:0;mso-wrap-distance-left:9pt;mso-wrap-distance-top:0;mso-wrap-distance-right:9pt;mso-wrap-distance-bottom:0;mso-position-horizontal:absolute;mso-position-horizontal-relative:text;mso-position-vertical:absolute;mso-position-vertical-relative:text;mso-width-percent:0;mso-height-percent:0;mso-width-relative:margin;mso-height-relative:margin;v-text-anchor:middle" o:gfxdata="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" fillcolor="#dbdbdb [1302]" strokecolor="black [3213]" strokeweight="1pt">
+              <v:oval w14:anchorId="2B4B1989" id="Oval 24" o:spid="_x0000_s1026" style="position:absolute;margin-left:272.45pt;margin-top:226.1pt;width:10.2pt;height:10.4pt;z-index:251693056;visibility:visible;mso-wrap-style:square;mso-width-percent:0;mso-height-percent:0;mso-wrap-distance-left:9pt;mso-wrap-distance-top:0;mso-wrap-distance-right:9pt;mso-wrap-distance-bottom:0;mso-position-horizontal:absolute;mso-position-horizontal-relative:text;mso-position-vertical:absolute;mso-position-vertical-relative:text;mso-width-percent:0;mso-height-percent:0;mso-width-relative:margin;mso-height-relative:margin;v-text-anchor:middle" o:gfxdata="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" fillcolor="#dbdbdb [1302]" strokecolor="black [3213]" strokeweight="1pt">
                 <v:fill color2="#636363 [1926]" rotate="t" focusposition=".5,85197f" focussize="" colors="0 #dbdbdb;30147f #a9a9a9;1 #636363" focus="100%" type="gradientRadial"/>
                 <v:stroke joinstyle="miter"/>
               </v:oval>
@@ -2494,7 +2923,7 @@
         <mc:AlternateContent>
           <mc:Choice Requires="wps">
             <w:drawing>
-              <wp:anchor distT="0" distB="0" distL="114300" distR="114300" simplePos="0" relativeHeight="251763712" behindDoc="0" locked="0" layoutInCell="1" allowOverlap="1" wp14:anchorId="3DC40BCA" wp14:editId="5E8CF55B">
+              <wp:anchor distT="0" distB="0" distL="114300" distR="114300" simplePos="0" relativeHeight="251762688" behindDoc="0" locked="0" layoutInCell="1" allowOverlap="1" wp14:anchorId="3DC40BCA" wp14:editId="54EB919E">
                 <wp:simplePos x="0" y="0"/>
                 <wp:positionH relativeFrom="column">
                   <wp:posOffset>2131181</wp:posOffset>
@@ -2568,7 +2997,7 @@
           </mc:Choice>
           <mc:Fallback>
             <w:pict>
-              <v:shape w14:anchorId="0F23EDEA" id="Multiply 32" o:spid="_x0000_s1026" style="position:absolute;margin-left:167.8pt;margin-top:290.55pt;width:18.6pt;height:18.95pt;z-index:251763712;visibility:visible;mso-wrap-style:square;mso-width-percent:0;mso-height-percent:0;mso-wrap-distance-left:9pt;mso-wrap-distance-top:0;mso-wrap-distance-right:9pt;mso-wrap-distance-bottom:0;mso-position-horizontal:absolute;mso-position-horizontal-relative:text;mso-position-vertical:absolute;mso-position-vertical-relative:text;mso-width-percent:0;mso-height-percent:0;mso-width-relative:margin;mso-height-relative:margin;v-text-anchor:middle" coordsize="236418,240780" o:gfxdata="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" path="m45379,69026l68185,46633r50024,50947l168233,46633r22806,22393l140605,120390r50434,51364l168233,194147,118209,143200,68185,194147,45379,171754,95813,120390,45379,69026xe" fillcolor="#747070 [1614]" strokecolor="black [3213]" strokeweight="1pt">
+              <v:shape w14:anchorId="4AF85E47" id="Multiply 32" o:spid="_x0000_s1026" style="position:absolute;margin-left:167.8pt;margin-top:290.55pt;width:18.6pt;height:18.95pt;z-index:251762688;visibility:visible;mso-wrap-style:square;mso-width-percent:0;mso-height-percent:0;mso-wrap-distance-left:9pt;mso-wrap-distance-top:0;mso-wrap-distance-right:9pt;mso-wrap-distance-bottom:0;mso-position-horizontal:absolute;mso-position-horizontal-relative:text;mso-position-vertical:absolute;mso-position-vertical-relative:text;mso-width-percent:0;mso-height-percent:0;mso-width-relative:margin;mso-height-relative:margin;v-text-anchor:middle" coordsize="236418,240780" o:gfxdata="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" path="m45379,69026l68185,46633r50024,50947l168233,46633r22806,22393l140605,120390r50434,51364l168233,194147,118209,143200,68185,194147,45379,171754,95813,120390,45379,69026xe" fillcolor="#747070 [1614]" strokecolor="black [3213]" strokeweight="1pt">
                 <v:stroke joinstyle="miter"/>
                 <v:path arrowok="t" o:connecttype="custom" o:connectlocs="45379,69026;68185,46633;118209,97580;168233,46633;191039,69026;140605,120390;191039,171754;168233,194147;118209,143200;68185,194147;45379,171754;95813,120390;45379,69026" o:connectangles="0,0,0,0,0,0,0,0,0,0,0,0,0"/>
               </v:shape>
@@ -2583,7 +3012,7 @@
         <mc:AlternateContent>
           <mc:Choice Requires="wps">
             <w:drawing>
-              <wp:anchor distT="0" distB="0" distL="114300" distR="114300" simplePos="0" relativeHeight="251700224" behindDoc="0" locked="0" layoutInCell="1" allowOverlap="1" wp14:anchorId="2C4AA0B2" wp14:editId="78667F52">
+              <wp:anchor distT="0" distB="0" distL="114300" distR="114300" simplePos="0" relativeHeight="251699200" behindDoc="0" locked="0" layoutInCell="1" allowOverlap="1" wp14:anchorId="2C4AA0B2" wp14:editId="300DDE37">
                 <wp:simplePos x="0" y="0"/>
                 <wp:positionH relativeFrom="column">
                   <wp:posOffset>4734431</wp:posOffset>
@@ -2657,13 +3086,62 @@
           </mc:Choice>
           <mc:Fallback>
             <w:pict>
-              <v:shape w14:anchorId="420FE4CF" id="Multiply 32" o:spid="_x0000_s1026" style="position:absolute;margin-left:372.8pt;margin-top:290.7pt;width:18.6pt;height:18.95pt;z-index:251700224;visibility:visible;mso-wrap-style:square;mso-width-percent:0;mso-height-percent:0;mso-wrap-distance-left:9pt;mso-wrap-distance-top:0;mso-wrap-distance-right:9pt;mso-wrap-distance-bottom:0;mso-position-horizontal:absolute;mso-position-horizontal-relative:text;mso-position-vertical:absolute;mso-position-vertical-relative:text;mso-width-percent:0;mso-height-percent:0;mso-width-relative:margin;mso-height-relative:margin;v-text-anchor:middle" coordsize="236418,240780" o:gfxdata="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" path="m45379,69026l68185,46633r50024,50947l168233,46633r22806,22393l140605,120390r50434,51364l168233,194147,118209,143200,68185,194147,45379,171754,95813,120390,45379,69026xe" fillcolor="#747070 [1614]" strokecolor="black [3213]" strokeweight="1pt">
+              <v:shape w14:anchorId="1F3CD0F0" id="Multiply 32" o:spid="_x0000_s1026" style="position:absolute;margin-left:372.8pt;margin-top:290.7pt;width:18.6pt;height:18.95pt;z-index:251699200;visibility:visible;mso-wrap-style:square;mso-width-percent:0;mso-height-percent:0;mso-wrap-distance-left:9pt;mso-wrap-distance-top:0;mso-wrap-distance-right:9pt;mso-wrap-distance-bottom:0;mso-position-horizontal:absolute;mso-position-horizontal-relative:text;mso-position-vertical:absolute;mso-position-vertical-relative:text;mso-width-percent:0;mso-height-percent:0;mso-width-relative:margin;mso-height-relative:margin;v-text-anchor:middle" coordsize="236418,240780" o:gfxdata="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" path="m45379,69026l68185,46633r50024,50947l168233,46633r22806,22393l140605,120390r50434,51364l168233,194147,118209,143200,68185,194147,45379,171754,95813,120390,45379,69026xe" fillcolor="#747070 [1614]" strokecolor="black [3213]" strokeweight="1pt">
                 <v:stroke joinstyle="miter"/>
                 <v:path arrowok="t" o:connecttype="custom" o:connectlocs="45379,69026;68185,46633;118209,97580;168233,46633;191039,69026;140605,120390;191039,171754;168233,194147;118209,143200;68185,194147;45379,171754;95813,120390;45379,69026" o:connectangles="0,0,0,0,0,0,0,0,0,0,0,0,0"/>
               </v:shape>
             </w:pict>
           </mc:Fallback>
         </mc:AlternateContent>
+      </w:r>
+      <w:r>
+        <w:rPr>
+          <w:noProof/>
+        </w:rPr>
+        <w:drawing>
+          <wp:inline distT="0" distB="0" distL="0" distR="0" wp14:anchorId="56EFA241" wp14:editId="4630BC06">
+            <wp:extent cx="3391382" cy="6494363"/>
+            <wp:effectExtent l="0" t="0" r="5715" b="0"/>
+            <wp:docPr id="1171954466" name="Picture 27"/>
+            <wp:cNvGraphicFramePr>
+              <a:graphicFrameLocks xmlns:a="http://schemas.openxmlformats.org/drawingml/2006/main" noChangeAspect="1"/>
+            </wp:cNvGraphicFramePr>
+            <a:graphic xmlns:a="http://schemas.openxmlformats.org/drawingml/2006/main">
+              <a:graphicData uri="http://schemas.openxmlformats.org/drawingml/2006/picture">
+                <pic:pic xmlns:pic="http://schemas.openxmlformats.org/drawingml/2006/picture">
+                  <pic:nvPicPr>
+                    <pic:cNvPr id="1171954466" name="Picture 1171954466"/>
+                    <pic:cNvPicPr/>
+                  </pic:nvPicPr>
+                  <pic:blipFill rotWithShape="1">
+                    <a:blip r:embed="rId9"/>
+                    <a:srcRect l="30788" t="9817" r="29987" b="33053"/>
+                    <a:stretch>
+                      <a:fillRect/>
+                    </a:stretch>
+                  </pic:blipFill>
+                  <pic:spPr bwMode="auto">
+                    <a:xfrm>
+                      <a:off x="0" y="0"/>
+                      <a:ext cx="3391382" cy="6494363"/>
+                    </a:xfrm>
+                    <a:prstGeom prst="rect">
+                      <a:avLst/>
+                    </a:prstGeom>
+                    <a:ln>
+                      <a:noFill/>
+                    </a:ln>
+                    <a:extLst>
+                      <a:ext uri="{53640926-AAD7-44D8-BBD7-CCE9431645EC}">
+                        <a14:shadowObscured xmlns:a14="http://schemas.microsoft.com/office/drawing/2010/main"/>
+                      </a:ext>
+                    </a:extLst>
+                  </pic:spPr>
+                </pic:pic>
+              </a:graphicData>
+            </a:graphic>
+          </wp:inline>
+        </w:drawing>
       </w:r>
     </w:p>
     <w:sectPr>
@@ -2677,7 +3155,7 @@
 </file>
 
 <file path=word/styles.xml><?xml version="1.0" encoding="utf-8"?>
-<w:styles xmlns:mc="http://schemas.openxmlformats.org/markup-compatibility/2006" xmlns:r="http://schemas.openxmlformats.org/officeDocument/2006/relationships" xmlns:w="http://schemas.openxmlformats.org/wordprocessingml/2006/main" xmlns:w14="http://schemas.microsoft.com/office/word/2010/wordml" xmlns:w15="http://schemas.microsoft.com/office/word/2012/wordml" xmlns:w16cex="http://schemas.microsoft.com/office/word/2018/wordml/cex" xmlns:w16cid="http://schemas.microsoft.com/office/word/2016/wordml/cid" xmlns:w16="http://schemas.microsoft.com/office/word/2018/wordml" xmlns:w16du="http://schemas.microsoft.com/office/word/2023/wordml/word16du" xmlns:w16sdtdh="http://schemas.microsoft.com/office/word/2020/wordml/sdtdatahash" xmlns:w16sdtfl="http://schemas.microsoft.com/office/word/2024/wordml/sdtformatlock" xmlns:w16se="http://schemas.microsoft.com/office/word/2015/wordml/symex" mc:Ignorable="w14 w15 w16se w16cid w16 w16cex w16sdtdh w16sdtfl w16du">
+<w:styles xmlns:mc="http://schemas.openxmlformats.org/markup-compatibility/2006" xmlns:r="http://schemas.openxmlformats.org/officeDocument/2006/relationships" xmlns:w="http://schemas.openxmlformats.org/wordprocessingml/2006/main" xmlns:w14="http://schemas.microsoft.com/office/word/2010/wordml" xmlns:w15="http://schemas.microsoft.com/office/word/2012/wordml" xmlns:w16cex="http://schemas.microsoft.com/office/word/2018/wordml/cex" xmlns:w16cid="http://schemas.microsoft.com/office/word/2016/wordml/cid" xmlns:w16="http://schemas.microsoft.com/office/word/2018/wordml" xmlns:w16sdtdh="http://schemas.microsoft.com/office/word/2020/wordml/sdtdatahash" xmlns:w16sdtfl="http://schemas.microsoft.com/office/word/2024/wordml/sdtformatlock" xmlns:w16se="http://schemas.microsoft.com/office/word/2015/wordml/symex" xmlns:w16du="http://schemas.microsoft.com/office/word/2023/wordml/word16du" mc:Ignorable="w14 w15 w16se w16cid w16 w16cex w16sdtdh w16sdtfl w16du">
   <w:docDefaults>
     <w:rPrDefault>
       <w:rPr>

</xml_diff>